<commit_message>
Fase 3: trazabilidad de S00013 en el MU-04 y en las secciones del informe
Las cuatro capturas que faltaban: el pedido S00013, su entrega RMT/OUT/00013, su
factura INV/2026/00015 y la lista con los 45 pedidos de la historia. El apartado
"Del sitio al ERP" queda con las tres pantallas del mismo registro.
</commit_message>
<xml_diff>
--- a/Entrega_Fase3_Grupo14/1_Informe/informe_fase3_secciones_Alberto_Hernandez.docx
+++ b/Entrega_Fase3_Grupo14/1_Informe/informe_fase3_secciones_Alberto_Hernandez.docx
@@ -2371,7 +2371,7 @@
           <w:i w:val="0"/>
           <w:color w:val="000000"/>
         </w:rPr>
-        <w:t>Como ejemplo se toma el pedido S00013, de Mónica Isabel Arévalo Soto, del 7 de octubre de 2026, por un kit de arrastre FRE-004 a Q 395.00 con impuesto incluido, Q 352.68 sin impuesto. Al confirmarse, Inventario creó la entrega RMT/OUT/00013, que quedó validada el 8 de octubre y descontó la unidad del almacén. Facturación emitió la factura INV/2026/00015 por los mismos Q 395.00, publicada y cobrada, con S00013 como documento de origen. Los tres registros son el mismo dato visto desde tres módulos.</w:t>
+        <w:t>Como ejemplo se toma el pedido S00013, de Mónica Isabel Arévalo Soto, del 7 de octubre de 2026, por un kit de arrastre FRE-004 a Q 395.00 con impuesto incluido, Q 352.68 sin impuesto. Al confirmarse, Inventario creó la entrega RMT/OUT/00013, que quedó validada esa misma noche y descontó la unidad del almacén. Facturación emitió la factura INV/2026/00015 por los mismos Q 395.00, con fecha del 8 de octubre, publicada y cobrada, con S00013 como documento de origen. Los tres registros son el mismo dato visto desde tres módulos.</w:t>
       </w:r>
     </w:p>
     <w:p>
@@ -2381,6 +2381,160 @@
           <w:color w:val="000000"/>
         </w:rPr>
         <w:t>Un pedido hecho desde la tienda recorre exactamente esta cadena, con dos diferencias: nace con el sitio web como origen en lugar del canal de ventas directas, y la factura la crea el propio sistema al confirmarse el pago, porque la facturación automática está activada. Los pedidos del apartado de pruebas de flujo completo documentan ese recorrido desde el navegador.</w:t>
+      </w:r>
+    </w:p>
+    <w:p>
+      <w:pPr>
+        <w:keepNext/>
+        <w:jc w:val="center"/>
+      </w:pPr>
+      <w:r>
+        <w:drawing>
+          <wp:inline xmlns:a="http://schemas.openxmlformats.org/drawingml/2006/main" xmlns:pic="http://schemas.openxmlformats.org/drawingml/2006/picture">
+            <wp:extent cx="5486400" cy="2975579"/>
+            <wp:docPr id="1460843497" name="Picture 1460843497"/>
+            <wp:cNvGraphicFramePr>
+              <a:graphicFrameLocks noChangeAspect="1"/>
+            </wp:cNvGraphicFramePr>
+            <a:graphic>
+              <a:graphicData uri="http://schemas.openxmlformats.org/drawingml/2006/picture">
+                <pic:pic>
+                  <pic:nvPicPr>
+                    <pic:cNvPr id="0" name="f16_pedido_s00013.png"/>
+                    <pic:cNvPicPr/>
+                  </pic:nvPicPr>
+                  <pic:blipFill>
+                    <a:blip r:embed="rId27"/>
+                    <a:stretch>
+                      <a:fillRect/>
+                    </a:stretch>
+                  </pic:blipFill>
+                  <pic:spPr>
+                    <a:xfrm>
+                      <a:off x="0" y="0"/>
+                      <a:ext cx="5486400" cy="2975579"/>
+                    </a:xfrm>
+                    <a:prstGeom prst="rect"/>
+                  </pic:spPr>
+                </pic:pic>
+              </a:graphicData>
+            </a:graphic>
+          </wp:inline>
+        </w:drawing>
+      </w:r>
+    </w:p>
+    <w:p>
+      <w:pPr>
+        <w:jc w:val="center"/>
+      </w:pPr>
+      <w:r>
+        <w:rPr>
+          <w:i/>
+          <w:color w:val="808080"/>
+        </w:rPr>
+        <w:t>Figura 9. El pedido S00013 en Ventas. Elaboración propia.</w:t>
+      </w:r>
+    </w:p>
+    <w:p>
+      <w:pPr>
+        <w:jc w:val="center"/>
+      </w:pPr>
+      <w:r>
+        <w:drawing>
+          <wp:inline xmlns:a="http://schemas.openxmlformats.org/drawingml/2006/main" xmlns:pic="http://schemas.openxmlformats.org/drawingml/2006/picture">
+            <wp:extent cx="5486400" cy="2975579"/>
+            <wp:docPr id="1460843498" name="Picture 1460843498"/>
+            <wp:cNvGraphicFramePr>
+              <a:graphicFrameLocks noChangeAspect="1"/>
+            </wp:cNvGraphicFramePr>
+            <a:graphic>
+              <a:graphicData uri="http://schemas.openxmlformats.org/drawingml/2006/picture">
+                <pic:pic>
+                  <pic:nvPicPr>
+                    <pic:cNvPr id="0" name="f17_entrega_s00013.png"/>
+                    <pic:cNvPicPr/>
+                  </pic:nvPicPr>
+                  <pic:blipFill>
+                    <a:blip r:embed="rId28"/>
+                    <a:stretch>
+                      <a:fillRect/>
+                    </a:stretch>
+                  </pic:blipFill>
+                  <pic:spPr>
+                    <a:xfrm>
+                      <a:off x="0" y="0"/>
+                      <a:ext cx="5486400" cy="2975579"/>
+                    </a:xfrm>
+                    <a:prstGeom prst="rect"/>
+                  </pic:spPr>
+                </pic:pic>
+              </a:graphicData>
+            </a:graphic>
+          </wp:inline>
+        </w:drawing>
+      </w:r>
+    </w:p>
+    <w:p>
+      <w:pPr>
+        <w:jc w:val="center"/>
+      </w:pPr>
+      <w:r>
+        <w:rPr>
+          <w:i/>
+          <w:color w:val="808080"/>
+        </w:rPr>
+        <w:t>Figura 10. La entrega RMT/OUT/00013, con S00013 como origen. Elaboración propia.</w:t>
+      </w:r>
+    </w:p>
+    <w:p>
+      <w:pPr>
+        <w:jc w:val="center"/>
+      </w:pPr>
+      <w:r>
+        <w:drawing>
+          <wp:inline xmlns:a="http://schemas.openxmlformats.org/drawingml/2006/main" xmlns:pic="http://schemas.openxmlformats.org/drawingml/2006/picture">
+            <wp:extent cx="5486400" cy="2975579"/>
+            <wp:docPr id="1460843499" name="Picture 1460843499"/>
+            <wp:cNvGraphicFramePr>
+              <a:graphicFrameLocks noChangeAspect="1"/>
+            </wp:cNvGraphicFramePr>
+            <a:graphic>
+              <a:graphicData uri="http://schemas.openxmlformats.org/drawingml/2006/picture">
+                <pic:pic>
+                  <pic:nvPicPr>
+                    <pic:cNvPr id="0" name="f18_factura_s00013.png"/>
+                    <pic:cNvPicPr/>
+                  </pic:nvPicPr>
+                  <pic:blipFill>
+                    <a:blip r:embed="rId29"/>
+                    <a:stretch>
+                      <a:fillRect/>
+                    </a:stretch>
+                  </pic:blipFill>
+                  <pic:spPr>
+                    <a:xfrm>
+                      <a:off x="0" y="0"/>
+                      <a:ext cx="5486400" cy="2975579"/>
+                    </a:xfrm>
+                    <a:prstGeom prst="rect"/>
+                  </pic:spPr>
+                </pic:pic>
+              </a:graphicData>
+            </a:graphic>
+          </wp:inline>
+        </w:drawing>
+      </w:r>
+    </w:p>
+    <w:p>
+      <w:pPr>
+        <w:jc w:val="center"/>
+      </w:pPr>
+      <w:r>
+        <w:rPr>
+          <w:i/>
+          <w:color w:val="808080"/>
+        </w:rPr>
+        <w:t>Figura 11. La factura INV/2026/00015, con S00013 como origen. Elaboración propia.</w:t>
       </w:r>
     </w:p>
     <w:p>
@@ -2448,6 +2602,58 @@
           <w:color w:val="000000"/>
         </w:rPr>
         <w:t>Dos advertencias para la lectura de los reportes. La primera es que esta historia es simulada y está declarada como tal: sirve para que el análisis tenga sobre qué trabajar, no como registro de operaciones reales. La segunda es que el porcentaje de entregas en menos de 24 horas quedó por debajo de la meta porque así salió la semilla del generador, no porque se haya buscado ese resultado.</w:t>
+      </w:r>
+    </w:p>
+    <w:p>
+      <w:pPr>
+        <w:keepNext/>
+        <w:jc w:val="center"/>
+      </w:pPr>
+      <w:r>
+        <w:drawing>
+          <wp:inline xmlns:a="http://schemas.openxmlformats.org/drawingml/2006/main" xmlns:pic="http://schemas.openxmlformats.org/drawingml/2006/picture">
+            <wp:extent cx="5486400" cy="2975579"/>
+            <wp:docPr id="1460843500" name="Picture 1460843500"/>
+            <wp:cNvGraphicFramePr>
+              <a:graphicFrameLocks noChangeAspect="1"/>
+            </wp:cNvGraphicFramePr>
+            <a:graphic>
+              <a:graphicData uri="http://schemas.openxmlformats.org/drawingml/2006/picture">
+                <pic:pic>
+                  <pic:nvPicPr>
+                    <pic:cNvPr id="0" name="f19_pedidos_historia.png"/>
+                    <pic:cNvPicPr/>
+                  </pic:nvPicPr>
+                  <pic:blipFill>
+                    <a:blip r:embed="rId30"/>
+                    <a:stretch>
+                      <a:fillRect/>
+                    </a:stretch>
+                  </pic:blipFill>
+                  <pic:spPr>
+                    <a:xfrm>
+                      <a:off x="0" y="0"/>
+                      <a:ext cx="5486400" cy="2975579"/>
+                    </a:xfrm>
+                    <a:prstGeom prst="rect"/>
+                  </pic:spPr>
+                </pic:pic>
+              </a:graphicData>
+            </a:graphic>
+          </wp:inline>
+        </w:drawing>
+      </w:r>
+    </w:p>
+    <w:p>
+      <w:pPr>
+        <w:jc w:val="center"/>
+      </w:pPr>
+      <w:r>
+        <w:rPr>
+          <w:i/>
+          <w:color w:val="808080"/>
+        </w:rPr>
+        <w:t>Figura 12. Los 45 pedidos de la historia en Ventas, con su cliente y su fecha. Elaboración propia.</w:t>
       </w:r>
     </w:p>
     <w:sectPr>

</xml_diff>